<commit_message>
Carga de archivos y estructura del proyecto
</commit_message>
<xml_diff>
--- a/Fase 2/Evidencias Grupales/2_4_GuiaEstudiante_Fase_2_DesarrolloProyecto_APT_G15.docx
+++ b/Fase 2/Evidencias Grupales/2_4_GuiaEstudiante_Fase_2_DesarrolloProyecto_APT_G15.docx
@@ -162,7 +162,6 @@
                                 </w:rPr>
                                 <w:t xml:space="preserve">Asignatura </w:t>
                               </w:r>
-                              <w:proofErr w:type="spellStart"/>
                               <w:r>
                                 <w:rPr>
                                   <w:b/>
@@ -172,7 +171,6 @@
                                 </w:rPr>
                                 <w:t>Capstone</w:t>
                               </w:r>
-                              <w:proofErr w:type="spellEnd"/>
                             </w:p>
                           </w:txbxContent>
                         </wps:txbx>
@@ -418,6 +416,7 @@
     </w:p>
     <w:p>
       <w:pPr>
+        <w:spacing w:after="0" w:line="240" w:lineRule="auto"/>
         <w:rPr>
           <w:rFonts w:cs="Calibri Light"/>
           <w:color w:val="595959" w:themeColor="text1" w:themeTint="A6"/>
@@ -426,6 +425,16 @@
           <w:lang w:val="es-ES"/>
         </w:rPr>
       </w:pPr>
+      <w:r>
+        <w:rPr>
+          <w:rFonts w:cs="Calibri Light"/>
+          <w:color w:val="595959" w:themeColor="text1" w:themeTint="A6"/>
+          <w:sz w:val="24"/>
+          <w:szCs w:val="24"/>
+          <w:lang w:val="es-ES"/>
+        </w:rPr>
+        <w:br w:type="page"/>
+      </w:r>
     </w:p>
     <w:tbl>
       <w:tblPr>
@@ -470,6 +479,7 @@
                 <w:sz w:val="28"/>
                 <w:szCs w:val="28"/>
               </w:rPr>
+              <w:lastRenderedPageBreak/>
               <w:t>1</w:t>
             </w:r>
             <w:r>
@@ -635,235 +645,55 @@
                 <w:sz w:val="20"/>
                 <w:szCs w:val="20"/>
               </w:rPr>
-              <w:t xml:space="preserve">Durante el periodo reportado se implementó el Producto Mínimo Viable (MVP) funcional sobre </w:t>
-            </w:r>
-            <w:proofErr w:type="spellStart"/>
+              <w:t>Durante el periodo reportado se implementó el Producto Mínimo Viable (MVP) funcional sobre Flutter 3 integrado a Firebase. Los objetivos específicos cumplidos y actividades ejecutadas comprenden:</w:t>
+            </w:r>
+          </w:p>
+          <w:p>
+            <w:pPr>
+              <w:spacing w:after="0"/>
+              <w:jc w:val="both"/>
+            </w:pPr>
+          </w:p>
+          <w:p>
+            <w:pPr>
+              <w:spacing w:after="0"/>
+              <w:jc w:val="both"/>
+            </w:pPr>
             <w:r>
               <w:rPr>
                 <w:rFonts w:ascii="Calibri" w:hAnsi="Calibri" w:cs="Arial"/>
                 <w:sz w:val="20"/>
                 <w:szCs w:val="20"/>
               </w:rPr>
-              <w:t>Flutter</w:t>
-            </w:r>
-            <w:proofErr w:type="spellEnd"/>
+              <w:t>• Autenticación y gestión de accesos (RF-01): Se desarrolló el flujo de autenticación con Firebase Auth y Firestore, estructurando roles de acceso diferenciados (particular, emergencia, administrador). La creación de cuentas de emergencia se implementó mediante la REST API de Firebase Identity Toolkit para evitar la desconexión del administrador.</w:t>
+            </w:r>
+          </w:p>
+          <w:p>
+            <w:pPr>
+              <w:spacing w:after="0"/>
+              <w:jc w:val="both"/>
+            </w:pPr>
             <w:r>
               <w:rPr>
                 <w:rFonts w:ascii="Calibri" w:hAnsi="Calibri" w:cs="Arial"/>
                 <w:sz w:val="20"/>
                 <w:szCs w:val="20"/>
               </w:rPr>
-              <w:t xml:space="preserve"> 3 integrado a </w:t>
-            </w:r>
-            <w:proofErr w:type="spellStart"/>
+              <w:t>• Activación de trazado de rutas de  emergencia (RF-02): Pantalla funcional para conductores de rescate con ciclo de vida completo (inicio, indexación en tiempo real y cierre de misión).</w:t>
+            </w:r>
+          </w:p>
+          <w:p>
+            <w:pPr>
+              <w:spacing w:after="0"/>
+              <w:jc w:val="both"/>
+            </w:pPr>
             <w:r>
               <w:rPr>
                 <w:rFonts w:ascii="Calibri" w:hAnsi="Calibri" w:cs="Arial"/>
                 <w:sz w:val="20"/>
                 <w:szCs w:val="20"/>
               </w:rPr>
-              <w:t>Firebase</w:t>
-            </w:r>
-            <w:proofErr w:type="spellEnd"/>
-            <w:r>
-              <w:rPr>
-                <w:rFonts w:ascii="Calibri" w:hAnsi="Calibri" w:cs="Arial"/>
-                <w:sz w:val="20"/>
-                <w:szCs w:val="20"/>
-              </w:rPr>
-              <w:t>. Los objetivos específicos cumplidos y actividades ejecutadas comprenden:</w:t>
-            </w:r>
-          </w:p>
-          <w:p>
-            <w:pPr>
-              <w:spacing w:after="0"/>
-              <w:jc w:val="both"/>
-            </w:pPr>
-          </w:p>
-          <w:p>
-            <w:pPr>
-              <w:spacing w:after="0"/>
-              <w:jc w:val="both"/>
-            </w:pPr>
-            <w:r>
-              <w:rPr>
-                <w:rFonts w:ascii="Calibri" w:hAnsi="Calibri" w:cs="Arial"/>
-                <w:sz w:val="20"/>
-                <w:szCs w:val="20"/>
-              </w:rPr>
-              <w:t xml:space="preserve">• Autenticación y gestión de accesos (RF-01): Se desarrolló el flujo de autenticación con </w:t>
-            </w:r>
-            <w:proofErr w:type="spellStart"/>
-            <w:r>
-              <w:rPr>
-                <w:rFonts w:ascii="Calibri" w:hAnsi="Calibri" w:cs="Arial"/>
-                <w:sz w:val="20"/>
-                <w:szCs w:val="20"/>
-              </w:rPr>
-              <w:t>Firebase</w:t>
-            </w:r>
-            <w:proofErr w:type="spellEnd"/>
-            <w:r>
-              <w:rPr>
-                <w:rFonts w:ascii="Calibri" w:hAnsi="Calibri" w:cs="Arial"/>
-                <w:sz w:val="20"/>
-                <w:szCs w:val="20"/>
-              </w:rPr>
-              <w:t xml:space="preserve"> Auth y </w:t>
-            </w:r>
-            <w:proofErr w:type="spellStart"/>
-            <w:r>
-              <w:rPr>
-                <w:rFonts w:ascii="Calibri" w:hAnsi="Calibri" w:cs="Arial"/>
-                <w:sz w:val="20"/>
-                <w:szCs w:val="20"/>
-              </w:rPr>
-              <w:t>Firestore</w:t>
-            </w:r>
-            <w:proofErr w:type="spellEnd"/>
-            <w:r>
-              <w:rPr>
-                <w:rFonts w:ascii="Calibri" w:hAnsi="Calibri" w:cs="Arial"/>
-                <w:sz w:val="20"/>
-                <w:szCs w:val="20"/>
-              </w:rPr>
-              <w:t xml:space="preserve">, estructurando roles de acceso diferenciados (particular, emergencia, administrador). La creación de cuentas de emergencia se implementó mediante la REST API de </w:t>
-            </w:r>
-            <w:proofErr w:type="spellStart"/>
-            <w:r>
-              <w:rPr>
-                <w:rFonts w:ascii="Calibri" w:hAnsi="Calibri" w:cs="Arial"/>
-                <w:sz w:val="20"/>
-                <w:szCs w:val="20"/>
-              </w:rPr>
-              <w:t>Firebase</w:t>
-            </w:r>
-            <w:proofErr w:type="spellEnd"/>
-            <w:r>
-              <w:rPr>
-                <w:rFonts w:ascii="Calibri" w:hAnsi="Calibri" w:cs="Arial"/>
-                <w:sz w:val="20"/>
-                <w:szCs w:val="20"/>
-              </w:rPr>
-              <w:t xml:space="preserve"> </w:t>
-            </w:r>
-            <w:proofErr w:type="spellStart"/>
-            <w:r>
-              <w:rPr>
-                <w:rFonts w:ascii="Calibri" w:hAnsi="Calibri" w:cs="Arial"/>
-                <w:sz w:val="20"/>
-                <w:szCs w:val="20"/>
-              </w:rPr>
-              <w:t>Identity</w:t>
-            </w:r>
-            <w:proofErr w:type="spellEnd"/>
-            <w:r>
-              <w:rPr>
-                <w:rFonts w:ascii="Calibri" w:hAnsi="Calibri" w:cs="Arial"/>
-                <w:sz w:val="20"/>
-                <w:szCs w:val="20"/>
-              </w:rPr>
-              <w:t xml:space="preserve"> </w:t>
-            </w:r>
-            <w:proofErr w:type="spellStart"/>
-            <w:r>
-              <w:rPr>
-                <w:rFonts w:ascii="Calibri" w:hAnsi="Calibri" w:cs="Arial"/>
-                <w:sz w:val="20"/>
-                <w:szCs w:val="20"/>
-              </w:rPr>
-              <w:t>Toolkit</w:t>
-            </w:r>
-            <w:proofErr w:type="spellEnd"/>
-            <w:r>
-              <w:rPr>
-                <w:rFonts w:ascii="Calibri" w:hAnsi="Calibri" w:cs="Arial"/>
-                <w:sz w:val="20"/>
-                <w:szCs w:val="20"/>
-              </w:rPr>
-              <w:t xml:space="preserve"> para evitar la desconexión del administrador.</w:t>
-            </w:r>
-          </w:p>
-          <w:p>
-            <w:pPr>
-              <w:spacing w:after="0"/>
-              <w:jc w:val="both"/>
-            </w:pPr>
-            <w:r>
-              <w:rPr>
-                <w:rFonts w:ascii="Calibri" w:hAnsi="Calibri" w:cs="Arial"/>
-                <w:sz w:val="20"/>
-                <w:szCs w:val="20"/>
-              </w:rPr>
-              <w:t xml:space="preserve">• Activación de trazado de rutas </w:t>
-            </w:r>
-            <w:proofErr w:type="gramStart"/>
-            <w:r>
-              <w:rPr>
-                <w:rFonts w:ascii="Calibri" w:hAnsi="Calibri" w:cs="Arial"/>
-                <w:sz w:val="20"/>
-                <w:szCs w:val="20"/>
-              </w:rPr>
-              <w:t>de  emergencia</w:t>
-            </w:r>
-            <w:proofErr w:type="gramEnd"/>
-            <w:r>
-              <w:rPr>
-                <w:rFonts w:ascii="Calibri" w:hAnsi="Calibri" w:cs="Arial"/>
-                <w:sz w:val="20"/>
-                <w:szCs w:val="20"/>
-              </w:rPr>
-              <w:t xml:space="preserve"> (RF-02): Pantalla funcional para conductores de rescate con ciclo de vida completo (inicio, indexación en tiempo real y cierre de misión).</w:t>
-            </w:r>
-          </w:p>
-          <w:p>
-            <w:pPr>
-              <w:spacing w:after="0"/>
-              <w:jc w:val="both"/>
-            </w:pPr>
-            <w:r>
-              <w:rPr>
-                <w:rFonts w:ascii="Calibri" w:hAnsi="Calibri" w:cs="Arial"/>
-                <w:sz w:val="20"/>
-                <w:szCs w:val="20"/>
-              </w:rPr>
-              <w:t xml:space="preserve">• Panel de administración web (RF-07): Módulo web en </w:t>
-            </w:r>
-            <w:proofErr w:type="spellStart"/>
-            <w:r>
-              <w:rPr>
-                <w:rFonts w:ascii="Calibri" w:hAnsi="Calibri" w:cs="Arial"/>
-                <w:sz w:val="20"/>
-                <w:szCs w:val="20"/>
-              </w:rPr>
-              <w:t>Flutter</w:t>
-            </w:r>
-            <w:proofErr w:type="spellEnd"/>
-            <w:r>
-              <w:rPr>
-                <w:rFonts w:ascii="Calibri" w:hAnsi="Calibri" w:cs="Arial"/>
-                <w:sz w:val="20"/>
-                <w:szCs w:val="20"/>
-              </w:rPr>
-              <w:t xml:space="preserve"> Web con operaciones CRUD sobre flota institucional y asignación de conductores mediante </w:t>
-            </w:r>
-            <w:proofErr w:type="spellStart"/>
-            <w:r>
-              <w:rPr>
-                <w:rFonts w:ascii="Calibri" w:hAnsi="Calibri" w:cs="Arial"/>
-                <w:sz w:val="20"/>
-                <w:szCs w:val="20"/>
-              </w:rPr>
-              <w:t>Firestore</w:t>
-            </w:r>
-            <w:proofErr w:type="spellEnd"/>
-            <w:r>
-              <w:rPr>
-                <w:rFonts w:ascii="Calibri" w:hAnsi="Calibri" w:cs="Arial"/>
-                <w:sz w:val="20"/>
-                <w:szCs w:val="20"/>
-              </w:rPr>
-              <w:t xml:space="preserve"> Streams.</w:t>
+              <w:t>• Panel de administración web (RF-07): Módulo web en Flutter Web con operaciones CRUD sobre flota institucional y asignación de conductores mediante Firestore Streams.</w:t>
             </w:r>
           </w:p>
           <w:p>
@@ -937,25 +767,7 @@
                 <w:sz w:val="20"/>
                 <w:szCs w:val="20"/>
               </w:rPr>
-              <w:t xml:space="preserve">- RF-06 (Configuración de umbrales por usuario): Queda diferido para la iteración de cierre. Los parámetros de anticipación (30 segundos) y velocidad estimada civil (40 km/h) operan centralizados en el </w:t>
-            </w:r>
-            <w:proofErr w:type="spellStart"/>
-            <w:r>
-              <w:rPr>
-                <w:rFonts w:ascii="Calibri" w:hAnsi="Calibri" w:cs="Arial"/>
-                <w:sz w:val="20"/>
-                <w:szCs w:val="20"/>
-              </w:rPr>
-              <w:t>core</w:t>
-            </w:r>
-            <w:proofErr w:type="spellEnd"/>
-            <w:r>
-              <w:rPr>
-                <w:rFonts w:ascii="Calibri" w:hAnsi="Calibri" w:cs="Arial"/>
-                <w:sz w:val="20"/>
-                <w:szCs w:val="20"/>
-              </w:rPr>
-              <w:t xml:space="preserve"> del sistema.</w:t>
+              <w:t>- RF-06 (Configuración de umbrales por usuario): Queda diferido para la iteración de cierre. Los parámetros de anticipación (30 segundos) y velocidad estimada civil (40 km/h) operan centralizados en el core del sistema.</w:t>
             </w:r>
           </w:p>
         </w:tc>
@@ -1015,97 +827,7 @@
                 <w:sz w:val="20"/>
                 <w:szCs w:val="20"/>
               </w:rPr>
-              <w:t xml:space="preserve">La arquitectura conceptual original basada en </w:t>
-            </w:r>
-            <w:proofErr w:type="spellStart"/>
-            <w:r>
-              <w:rPr>
-                <w:rFonts w:ascii="Calibri" w:hAnsi="Calibri" w:cs="Arial"/>
-                <w:sz w:val="20"/>
-                <w:szCs w:val="20"/>
-              </w:rPr>
-              <w:t>WebSocket</w:t>
-            </w:r>
-            <w:proofErr w:type="spellEnd"/>
-            <w:r>
-              <w:rPr>
-                <w:rFonts w:ascii="Calibri" w:hAnsi="Calibri" w:cs="Arial"/>
-                <w:sz w:val="20"/>
-                <w:szCs w:val="20"/>
-              </w:rPr>
-              <w:t xml:space="preserve">/MQTT y Redis </w:t>
-            </w:r>
-            <w:proofErr w:type="spellStart"/>
-            <w:r>
-              <w:rPr>
-                <w:rFonts w:ascii="Calibri" w:hAnsi="Calibri" w:cs="Arial"/>
-                <w:sz w:val="20"/>
-                <w:szCs w:val="20"/>
-              </w:rPr>
-              <w:t>Geospatial</w:t>
-            </w:r>
-            <w:proofErr w:type="spellEnd"/>
-            <w:r>
-              <w:rPr>
-                <w:rFonts w:ascii="Calibri" w:hAnsi="Calibri" w:cs="Arial"/>
-                <w:sz w:val="20"/>
-                <w:szCs w:val="20"/>
-              </w:rPr>
-              <w:t xml:space="preserve"> fue reemplazada para el MVP por </w:t>
-            </w:r>
-            <w:proofErr w:type="spellStart"/>
-            <w:r>
-              <w:rPr>
-                <w:rFonts w:ascii="Calibri" w:hAnsi="Calibri" w:cs="Arial"/>
-                <w:sz w:val="20"/>
-                <w:szCs w:val="20"/>
-              </w:rPr>
-              <w:t>Firebase</w:t>
-            </w:r>
-            <w:proofErr w:type="spellEnd"/>
-            <w:r>
-              <w:rPr>
-                <w:rFonts w:ascii="Calibri" w:hAnsi="Calibri" w:cs="Arial"/>
-                <w:sz w:val="20"/>
-                <w:szCs w:val="20"/>
-              </w:rPr>
-              <w:t xml:space="preserve"> </w:t>
-            </w:r>
-            <w:proofErr w:type="spellStart"/>
-            <w:r>
-              <w:rPr>
-                <w:rFonts w:ascii="Calibri" w:hAnsi="Calibri" w:cs="Arial"/>
-                <w:sz w:val="20"/>
-                <w:szCs w:val="20"/>
-              </w:rPr>
-              <w:t>Realtime</w:t>
-            </w:r>
-            <w:proofErr w:type="spellEnd"/>
-            <w:r>
-              <w:rPr>
-                <w:rFonts w:ascii="Calibri" w:hAnsi="Calibri" w:cs="Arial"/>
-                <w:sz w:val="20"/>
-                <w:szCs w:val="20"/>
-              </w:rPr>
-              <w:t xml:space="preserve"> </w:t>
-            </w:r>
-            <w:proofErr w:type="spellStart"/>
-            <w:r>
-              <w:rPr>
-                <w:rFonts w:ascii="Calibri" w:hAnsi="Calibri" w:cs="Arial"/>
-                <w:sz w:val="20"/>
-                <w:szCs w:val="20"/>
-              </w:rPr>
-              <w:t>Database</w:t>
-            </w:r>
-            <w:proofErr w:type="spellEnd"/>
-            <w:r>
-              <w:rPr>
-                <w:rFonts w:ascii="Calibri" w:hAnsi="Calibri" w:cs="Arial"/>
-                <w:sz w:val="20"/>
-                <w:szCs w:val="20"/>
-              </w:rPr>
-              <w:t>. Esta decisión metodológica eliminó la sobrecarga de despliegue de servidores dedicados, garantizó latencias de sincronización menores a 2 segundos y aseguró compatibilidad multiplataforma nativa dentro de los plazos académicos.</w:t>
+              <w:t>La arquitectura conceptual original basada en WebSocket/MQTT y Redis Geospatial fue reemplazada para el MVP por Firebase Realtime Database. Esta decisión metodológica eliminó la sobrecarga de despliegue de servidores dedicados, garantizó latencias de sincronización menores a 2 segundos y aseguró compatibilidad multiplataforma nativa dentro de los plazos académicos.</w:t>
             </w:r>
           </w:p>
         </w:tc>
@@ -1131,7 +853,6 @@
                 <w:rFonts w:ascii="Calibri" w:hAnsi="Calibri"/>
                 <w:color w:val="1F3864" w:themeColor="accent1" w:themeShade="80"/>
               </w:rPr>
-              <w:lastRenderedPageBreak/>
               <w:t>Evidencias de avance</w:t>
             </w:r>
           </w:p>
@@ -1172,559 +893,92 @@
                 <w:sz w:val="20"/>
                 <w:szCs w:val="20"/>
               </w:rPr>
-              <w:t>1. Capa de Modelos (/</w:t>
-            </w:r>
-            <w:proofErr w:type="spellStart"/>
+              <w:t>1. Capa de Modelos (/lib/models): Entidades de dominio con serialización bidireccional (User, Vehicle, Emergency, LocationData) y control de estados.</w:t>
+            </w:r>
+          </w:p>
+          <w:p>
+            <w:pPr>
+              <w:spacing w:after="0"/>
+              <w:jc w:val="both"/>
+            </w:pPr>
             <w:r>
               <w:rPr>
                 <w:rFonts w:ascii="Calibri" w:hAnsi="Calibri" w:cs="Arial"/>
                 <w:sz w:val="20"/>
                 <w:szCs w:val="20"/>
               </w:rPr>
-              <w:t>lib</w:t>
-            </w:r>
-            <w:proofErr w:type="spellEnd"/>
+              <w:t>2. Capa de Servicios (/lib/services): Cuatro servicios modulares desacoplados:</w:t>
+            </w:r>
+          </w:p>
+          <w:p>
+            <w:pPr>
+              <w:spacing w:after="0"/>
+              <w:jc w:val="both"/>
+            </w:pPr>
             <w:r>
               <w:rPr>
                 <w:rFonts w:ascii="Calibri" w:hAnsi="Calibri" w:cs="Arial"/>
                 <w:sz w:val="20"/>
                 <w:szCs w:val="20"/>
               </w:rPr>
-              <w:t>/</w:t>
-            </w:r>
-            <w:proofErr w:type="spellStart"/>
+              <w:t>- AuthService: Gestión de sesión e invocación directa a Identity Toolkit REST API.</w:t>
+            </w:r>
+          </w:p>
+          <w:p>
+            <w:pPr>
+              <w:spacing w:after="0"/>
+              <w:jc w:val="both"/>
+            </w:pPr>
             <w:r>
               <w:rPr>
                 <w:rFonts w:ascii="Calibri" w:hAnsi="Calibri" w:cs="Arial"/>
                 <w:sz w:val="20"/>
                 <w:szCs w:val="20"/>
               </w:rPr>
-              <w:t>models</w:t>
-            </w:r>
-            <w:proofErr w:type="spellEnd"/>
+              <w:t>- LocationService: Ingesta de GPS con Geolocator, normalización de velocidad (0-200 km/h) y publicación a Realtime Database.</w:t>
+            </w:r>
+          </w:p>
+          <w:p>
+            <w:pPr>
+              <w:spacing w:after="0"/>
+              <w:jc w:val="both"/>
+            </w:pPr>
             <w:r>
               <w:rPr>
                 <w:rFonts w:ascii="Calibri" w:hAnsi="Calibri" w:cs="Arial"/>
                 <w:sz w:val="20"/>
                 <w:szCs w:val="20"/>
               </w:rPr>
-              <w:t>): Entidades de dominio con serialización bidireccional (</w:t>
-            </w:r>
-            <w:proofErr w:type="spellStart"/>
+              <w:t>- GeofencingService: Funciones puras para cálculo de distancia geodésica (Haversine) y flujo reactivo de intercepción.</w:t>
+            </w:r>
+          </w:p>
+          <w:p>
+            <w:pPr>
+              <w:spacing w:after="0"/>
+              <w:jc w:val="both"/>
+            </w:pPr>
             <w:r>
               <w:rPr>
                 <w:rFonts w:ascii="Calibri" w:hAnsi="Calibri" w:cs="Arial"/>
                 <w:sz w:val="20"/>
                 <w:szCs w:val="20"/>
               </w:rPr>
-              <w:t>User</w:t>
-            </w:r>
-            <w:proofErr w:type="spellEnd"/>
+              <w:t>3. Capa de Presentación (/lib/screens y /lib/widgets): Pantallas diferenciadas por rol (AdminDashboard, EmergencyScreen, DriverScreen) y componente de alerta visual pulsante.</w:t>
+            </w:r>
+          </w:p>
+          <w:p>
+            <w:pPr>
+              <w:spacing w:after="0"/>
+              <w:jc w:val="both"/>
+            </w:pPr>
             <w:r>
               <w:rPr>
                 <w:rFonts w:ascii="Calibri" w:hAnsi="Calibri" w:cs="Arial"/>
                 <w:sz w:val="20"/>
                 <w:szCs w:val="20"/>
               </w:rPr>
-              <w:t xml:space="preserve">, </w:t>
-            </w:r>
-            <w:proofErr w:type="spellStart"/>
-            <w:r>
-              <w:rPr>
-                <w:rFonts w:ascii="Calibri" w:hAnsi="Calibri" w:cs="Arial"/>
-                <w:sz w:val="20"/>
-                <w:szCs w:val="20"/>
-              </w:rPr>
-              <w:t>Vehicle</w:t>
-            </w:r>
-            <w:proofErr w:type="spellEnd"/>
-            <w:r>
-              <w:rPr>
-                <w:rFonts w:ascii="Calibri" w:hAnsi="Calibri" w:cs="Arial"/>
-                <w:sz w:val="20"/>
-                <w:szCs w:val="20"/>
-              </w:rPr>
-              <w:t xml:space="preserve">, </w:t>
-            </w:r>
-            <w:proofErr w:type="spellStart"/>
-            <w:r>
-              <w:rPr>
-                <w:rFonts w:ascii="Calibri" w:hAnsi="Calibri" w:cs="Arial"/>
-                <w:sz w:val="20"/>
-                <w:szCs w:val="20"/>
-              </w:rPr>
-              <w:t>Emergency</w:t>
-            </w:r>
-            <w:proofErr w:type="spellEnd"/>
-            <w:r>
-              <w:rPr>
-                <w:rFonts w:ascii="Calibri" w:hAnsi="Calibri" w:cs="Arial"/>
-                <w:sz w:val="20"/>
-                <w:szCs w:val="20"/>
-              </w:rPr>
-              <w:t xml:space="preserve">, </w:t>
-            </w:r>
-            <w:proofErr w:type="spellStart"/>
-            <w:r>
-              <w:rPr>
-                <w:rFonts w:ascii="Calibri" w:hAnsi="Calibri" w:cs="Arial"/>
-                <w:sz w:val="20"/>
-                <w:szCs w:val="20"/>
-              </w:rPr>
-              <w:t>LocationData</w:t>
-            </w:r>
-            <w:proofErr w:type="spellEnd"/>
-            <w:r>
-              <w:rPr>
-                <w:rFonts w:ascii="Calibri" w:hAnsi="Calibri" w:cs="Arial"/>
-                <w:sz w:val="20"/>
-                <w:szCs w:val="20"/>
-              </w:rPr>
-              <w:t>) y control de estados.</w:t>
-            </w:r>
-          </w:p>
-          <w:p>
-            <w:pPr>
-              <w:spacing w:after="0"/>
-              <w:jc w:val="both"/>
-            </w:pPr>
-            <w:r>
-              <w:rPr>
-                <w:rFonts w:ascii="Calibri" w:hAnsi="Calibri" w:cs="Arial"/>
-                <w:sz w:val="20"/>
-                <w:szCs w:val="20"/>
-              </w:rPr>
-              <w:t>2. Capa de Servicios (/</w:t>
-            </w:r>
-            <w:proofErr w:type="spellStart"/>
-            <w:r>
-              <w:rPr>
-                <w:rFonts w:ascii="Calibri" w:hAnsi="Calibri" w:cs="Arial"/>
-                <w:sz w:val="20"/>
-                <w:szCs w:val="20"/>
-              </w:rPr>
-              <w:t>lib</w:t>
-            </w:r>
-            <w:proofErr w:type="spellEnd"/>
-            <w:r>
-              <w:rPr>
-                <w:rFonts w:ascii="Calibri" w:hAnsi="Calibri" w:cs="Arial"/>
-                <w:sz w:val="20"/>
-                <w:szCs w:val="20"/>
-              </w:rPr>
-              <w:t>/</w:t>
-            </w:r>
-            <w:proofErr w:type="spellStart"/>
-            <w:r>
-              <w:rPr>
-                <w:rFonts w:ascii="Calibri" w:hAnsi="Calibri" w:cs="Arial"/>
-                <w:sz w:val="20"/>
-                <w:szCs w:val="20"/>
-              </w:rPr>
-              <w:t>services</w:t>
-            </w:r>
-            <w:proofErr w:type="spellEnd"/>
-            <w:r>
-              <w:rPr>
-                <w:rFonts w:ascii="Calibri" w:hAnsi="Calibri" w:cs="Arial"/>
-                <w:sz w:val="20"/>
-                <w:szCs w:val="20"/>
-              </w:rPr>
-              <w:t>): Cuatro servicios modulares desacoplados:</w:t>
-            </w:r>
-          </w:p>
-          <w:p>
-            <w:pPr>
-              <w:spacing w:after="0"/>
-              <w:jc w:val="both"/>
-            </w:pPr>
-            <w:r>
-              <w:rPr>
-                <w:rFonts w:ascii="Calibri" w:hAnsi="Calibri" w:cs="Arial"/>
-                <w:sz w:val="20"/>
-                <w:szCs w:val="20"/>
-              </w:rPr>
-              <w:t xml:space="preserve">- </w:t>
-            </w:r>
-            <w:proofErr w:type="spellStart"/>
-            <w:r>
-              <w:rPr>
-                <w:rFonts w:ascii="Calibri" w:hAnsi="Calibri" w:cs="Arial"/>
-                <w:sz w:val="20"/>
-                <w:szCs w:val="20"/>
-              </w:rPr>
-              <w:t>AuthService</w:t>
-            </w:r>
-            <w:proofErr w:type="spellEnd"/>
-            <w:r>
-              <w:rPr>
-                <w:rFonts w:ascii="Calibri" w:hAnsi="Calibri" w:cs="Arial"/>
-                <w:sz w:val="20"/>
-                <w:szCs w:val="20"/>
-              </w:rPr>
-              <w:t xml:space="preserve">: Gestión de sesión e invocación directa a </w:t>
-            </w:r>
-            <w:proofErr w:type="spellStart"/>
-            <w:r>
-              <w:rPr>
-                <w:rFonts w:ascii="Calibri" w:hAnsi="Calibri" w:cs="Arial"/>
-                <w:sz w:val="20"/>
-                <w:szCs w:val="20"/>
-              </w:rPr>
-              <w:t>Identity</w:t>
-            </w:r>
-            <w:proofErr w:type="spellEnd"/>
-            <w:r>
-              <w:rPr>
-                <w:rFonts w:ascii="Calibri" w:hAnsi="Calibri" w:cs="Arial"/>
-                <w:sz w:val="20"/>
-                <w:szCs w:val="20"/>
-              </w:rPr>
-              <w:t xml:space="preserve"> </w:t>
-            </w:r>
-            <w:proofErr w:type="spellStart"/>
-            <w:r>
-              <w:rPr>
-                <w:rFonts w:ascii="Calibri" w:hAnsi="Calibri" w:cs="Arial"/>
-                <w:sz w:val="20"/>
-                <w:szCs w:val="20"/>
-              </w:rPr>
-              <w:t>Toolkit</w:t>
-            </w:r>
-            <w:proofErr w:type="spellEnd"/>
-            <w:r>
-              <w:rPr>
-                <w:rFonts w:ascii="Calibri" w:hAnsi="Calibri" w:cs="Arial"/>
-                <w:sz w:val="20"/>
-                <w:szCs w:val="20"/>
-              </w:rPr>
-              <w:t xml:space="preserve"> REST API.</w:t>
-            </w:r>
-          </w:p>
-          <w:p>
-            <w:pPr>
-              <w:spacing w:after="0"/>
-              <w:jc w:val="both"/>
-            </w:pPr>
-            <w:r>
-              <w:rPr>
-                <w:rFonts w:ascii="Calibri" w:hAnsi="Calibri" w:cs="Arial"/>
-                <w:sz w:val="20"/>
-                <w:szCs w:val="20"/>
-              </w:rPr>
-              <w:t xml:space="preserve">- </w:t>
-            </w:r>
-            <w:proofErr w:type="spellStart"/>
-            <w:r>
-              <w:rPr>
-                <w:rFonts w:ascii="Calibri" w:hAnsi="Calibri" w:cs="Arial"/>
-                <w:sz w:val="20"/>
-                <w:szCs w:val="20"/>
-              </w:rPr>
-              <w:t>LocationService</w:t>
-            </w:r>
-            <w:proofErr w:type="spellEnd"/>
-            <w:r>
-              <w:rPr>
-                <w:rFonts w:ascii="Calibri" w:hAnsi="Calibri" w:cs="Arial"/>
-                <w:sz w:val="20"/>
-                <w:szCs w:val="20"/>
-              </w:rPr>
-              <w:t xml:space="preserve">: Ingesta de GPS con </w:t>
-            </w:r>
-            <w:proofErr w:type="spellStart"/>
-            <w:r>
-              <w:rPr>
-                <w:rFonts w:ascii="Calibri" w:hAnsi="Calibri" w:cs="Arial"/>
-                <w:sz w:val="20"/>
-                <w:szCs w:val="20"/>
-              </w:rPr>
-              <w:t>Geolocator</w:t>
-            </w:r>
-            <w:proofErr w:type="spellEnd"/>
-            <w:r>
-              <w:rPr>
-                <w:rFonts w:ascii="Calibri" w:hAnsi="Calibri" w:cs="Arial"/>
-                <w:sz w:val="20"/>
-                <w:szCs w:val="20"/>
-              </w:rPr>
-              <w:t xml:space="preserve">, normalización de velocidad (0-200 km/h) y publicación a </w:t>
-            </w:r>
-            <w:proofErr w:type="spellStart"/>
-            <w:r>
-              <w:rPr>
-                <w:rFonts w:ascii="Calibri" w:hAnsi="Calibri" w:cs="Arial"/>
-                <w:sz w:val="20"/>
-                <w:szCs w:val="20"/>
-              </w:rPr>
-              <w:t>Realtime</w:t>
-            </w:r>
-            <w:proofErr w:type="spellEnd"/>
-            <w:r>
-              <w:rPr>
-                <w:rFonts w:ascii="Calibri" w:hAnsi="Calibri" w:cs="Arial"/>
-                <w:sz w:val="20"/>
-                <w:szCs w:val="20"/>
-              </w:rPr>
-              <w:t xml:space="preserve"> </w:t>
-            </w:r>
-            <w:proofErr w:type="spellStart"/>
-            <w:r>
-              <w:rPr>
-                <w:rFonts w:ascii="Calibri" w:hAnsi="Calibri" w:cs="Arial"/>
-                <w:sz w:val="20"/>
-                <w:szCs w:val="20"/>
-              </w:rPr>
-              <w:t>Database</w:t>
-            </w:r>
-            <w:proofErr w:type="spellEnd"/>
-            <w:r>
-              <w:rPr>
-                <w:rFonts w:ascii="Calibri" w:hAnsi="Calibri" w:cs="Arial"/>
-                <w:sz w:val="20"/>
-                <w:szCs w:val="20"/>
-              </w:rPr>
-              <w:t>.</w:t>
-            </w:r>
-          </w:p>
-          <w:p>
-            <w:pPr>
-              <w:spacing w:after="0"/>
-              <w:jc w:val="both"/>
-            </w:pPr>
-            <w:r>
-              <w:rPr>
-                <w:rFonts w:ascii="Calibri" w:hAnsi="Calibri" w:cs="Arial"/>
-                <w:sz w:val="20"/>
-                <w:szCs w:val="20"/>
-              </w:rPr>
-              <w:t xml:space="preserve">- </w:t>
-            </w:r>
-            <w:proofErr w:type="spellStart"/>
-            <w:r>
-              <w:rPr>
-                <w:rFonts w:ascii="Calibri" w:hAnsi="Calibri" w:cs="Arial"/>
-                <w:sz w:val="20"/>
-                <w:szCs w:val="20"/>
-              </w:rPr>
-              <w:t>GeofencingService</w:t>
-            </w:r>
-            <w:proofErr w:type="spellEnd"/>
-            <w:r>
-              <w:rPr>
-                <w:rFonts w:ascii="Calibri" w:hAnsi="Calibri" w:cs="Arial"/>
-                <w:sz w:val="20"/>
-                <w:szCs w:val="20"/>
-              </w:rPr>
-              <w:t>: Funciones puras para cálculo de distancia geodésica (</w:t>
-            </w:r>
-            <w:proofErr w:type="spellStart"/>
-            <w:r>
-              <w:rPr>
-                <w:rFonts w:ascii="Calibri" w:hAnsi="Calibri" w:cs="Arial"/>
-                <w:sz w:val="20"/>
-                <w:szCs w:val="20"/>
-              </w:rPr>
-              <w:t>Haversine</w:t>
-            </w:r>
-            <w:proofErr w:type="spellEnd"/>
-            <w:r>
-              <w:rPr>
-                <w:rFonts w:ascii="Calibri" w:hAnsi="Calibri" w:cs="Arial"/>
-                <w:sz w:val="20"/>
-                <w:szCs w:val="20"/>
-              </w:rPr>
-              <w:t>) y flujo reactivo de intercepción.</w:t>
-            </w:r>
-          </w:p>
-          <w:p>
-            <w:pPr>
-              <w:spacing w:after="0"/>
-              <w:jc w:val="both"/>
-            </w:pPr>
-            <w:r>
-              <w:rPr>
-                <w:rFonts w:ascii="Calibri" w:hAnsi="Calibri" w:cs="Arial"/>
-                <w:sz w:val="20"/>
-                <w:szCs w:val="20"/>
-              </w:rPr>
-              <w:t>3. Capa de Presentación (/</w:t>
-            </w:r>
-            <w:proofErr w:type="spellStart"/>
-            <w:r>
-              <w:rPr>
-                <w:rFonts w:ascii="Calibri" w:hAnsi="Calibri" w:cs="Arial"/>
-                <w:sz w:val="20"/>
-                <w:szCs w:val="20"/>
-              </w:rPr>
-              <w:t>lib</w:t>
-            </w:r>
-            <w:proofErr w:type="spellEnd"/>
-            <w:r>
-              <w:rPr>
-                <w:rFonts w:ascii="Calibri" w:hAnsi="Calibri" w:cs="Arial"/>
-                <w:sz w:val="20"/>
-                <w:szCs w:val="20"/>
-              </w:rPr>
-              <w:t>/</w:t>
-            </w:r>
-            <w:proofErr w:type="spellStart"/>
-            <w:r>
-              <w:rPr>
-                <w:rFonts w:ascii="Calibri" w:hAnsi="Calibri" w:cs="Arial"/>
-                <w:sz w:val="20"/>
-                <w:szCs w:val="20"/>
-              </w:rPr>
-              <w:t>screens</w:t>
-            </w:r>
-            <w:proofErr w:type="spellEnd"/>
-            <w:r>
-              <w:rPr>
-                <w:rFonts w:ascii="Calibri" w:hAnsi="Calibri" w:cs="Arial"/>
-                <w:sz w:val="20"/>
-                <w:szCs w:val="20"/>
-              </w:rPr>
-              <w:t xml:space="preserve"> y /</w:t>
-            </w:r>
-            <w:proofErr w:type="spellStart"/>
-            <w:r>
-              <w:rPr>
-                <w:rFonts w:ascii="Calibri" w:hAnsi="Calibri" w:cs="Arial"/>
-                <w:sz w:val="20"/>
-                <w:szCs w:val="20"/>
-              </w:rPr>
-              <w:t>lib</w:t>
-            </w:r>
-            <w:proofErr w:type="spellEnd"/>
-            <w:r>
-              <w:rPr>
-                <w:rFonts w:ascii="Calibri" w:hAnsi="Calibri" w:cs="Arial"/>
-                <w:sz w:val="20"/>
-                <w:szCs w:val="20"/>
-              </w:rPr>
-              <w:t>/widgets): Pantallas diferenciadas por rol (</w:t>
-            </w:r>
-            <w:proofErr w:type="spellStart"/>
-            <w:r>
-              <w:rPr>
-                <w:rFonts w:ascii="Calibri" w:hAnsi="Calibri" w:cs="Arial"/>
-                <w:sz w:val="20"/>
-                <w:szCs w:val="20"/>
-              </w:rPr>
-              <w:t>AdminDashboard</w:t>
-            </w:r>
-            <w:proofErr w:type="spellEnd"/>
-            <w:r>
-              <w:rPr>
-                <w:rFonts w:ascii="Calibri" w:hAnsi="Calibri" w:cs="Arial"/>
-                <w:sz w:val="20"/>
-                <w:szCs w:val="20"/>
-              </w:rPr>
-              <w:t xml:space="preserve">, </w:t>
-            </w:r>
-            <w:proofErr w:type="spellStart"/>
-            <w:r>
-              <w:rPr>
-                <w:rFonts w:ascii="Calibri" w:hAnsi="Calibri" w:cs="Arial"/>
-                <w:sz w:val="20"/>
-                <w:szCs w:val="20"/>
-              </w:rPr>
-              <w:t>EmergencyScreen</w:t>
-            </w:r>
-            <w:proofErr w:type="spellEnd"/>
-            <w:r>
-              <w:rPr>
-                <w:rFonts w:ascii="Calibri" w:hAnsi="Calibri" w:cs="Arial"/>
-                <w:sz w:val="20"/>
-                <w:szCs w:val="20"/>
-              </w:rPr>
-              <w:t xml:space="preserve">, </w:t>
-            </w:r>
-            <w:proofErr w:type="spellStart"/>
-            <w:r>
-              <w:rPr>
-                <w:rFonts w:ascii="Calibri" w:hAnsi="Calibri" w:cs="Arial"/>
-                <w:sz w:val="20"/>
-                <w:szCs w:val="20"/>
-              </w:rPr>
-              <w:t>DriverScreen</w:t>
-            </w:r>
-            <w:proofErr w:type="spellEnd"/>
-            <w:r>
-              <w:rPr>
-                <w:rFonts w:ascii="Calibri" w:hAnsi="Calibri" w:cs="Arial"/>
-                <w:sz w:val="20"/>
-                <w:szCs w:val="20"/>
-              </w:rPr>
-              <w:t>) y componente de alerta visual pulsante.</w:t>
-            </w:r>
-          </w:p>
-          <w:p>
-            <w:pPr>
-              <w:spacing w:after="0"/>
-              <w:jc w:val="both"/>
-            </w:pPr>
-            <w:r>
-              <w:rPr>
-                <w:rFonts w:ascii="Calibri" w:hAnsi="Calibri" w:cs="Arial"/>
-                <w:sz w:val="20"/>
-                <w:szCs w:val="20"/>
-              </w:rPr>
-              <w:t>4. Resguardo de la Calidad Disciplinar: Se aplicaron principios de diseño desacoplado (</w:t>
-            </w:r>
-            <w:proofErr w:type="gramStart"/>
-            <w:r>
-              <w:rPr>
-                <w:rFonts w:ascii="Calibri" w:hAnsi="Calibri" w:cs="Arial"/>
-                <w:sz w:val="20"/>
-                <w:szCs w:val="20"/>
-              </w:rPr>
-              <w:t>Single</w:t>
-            </w:r>
-            <w:proofErr w:type="gramEnd"/>
-            <w:r>
-              <w:rPr>
-                <w:rFonts w:ascii="Calibri" w:hAnsi="Calibri" w:cs="Arial"/>
-                <w:sz w:val="20"/>
-                <w:szCs w:val="20"/>
-              </w:rPr>
-              <w:t xml:space="preserve"> </w:t>
-            </w:r>
-            <w:proofErr w:type="spellStart"/>
-            <w:r>
-              <w:rPr>
-                <w:rFonts w:ascii="Calibri" w:hAnsi="Calibri" w:cs="Arial"/>
-                <w:sz w:val="20"/>
-                <w:szCs w:val="20"/>
-              </w:rPr>
-              <w:t>Responsibility</w:t>
-            </w:r>
-            <w:proofErr w:type="spellEnd"/>
-            <w:r>
-              <w:rPr>
-                <w:rFonts w:ascii="Calibri" w:hAnsi="Calibri" w:cs="Arial"/>
-                <w:sz w:val="20"/>
-                <w:szCs w:val="20"/>
-              </w:rPr>
-              <w:t xml:space="preserve"> </w:t>
-            </w:r>
-            <w:proofErr w:type="spellStart"/>
-            <w:r>
-              <w:rPr>
-                <w:rFonts w:ascii="Calibri" w:hAnsi="Calibri" w:cs="Arial"/>
-                <w:sz w:val="20"/>
-                <w:szCs w:val="20"/>
-              </w:rPr>
-              <w:t>Principle</w:t>
-            </w:r>
-            <w:proofErr w:type="spellEnd"/>
-            <w:r>
-              <w:rPr>
-                <w:rFonts w:ascii="Calibri" w:hAnsi="Calibri" w:cs="Arial"/>
-                <w:sz w:val="20"/>
-                <w:szCs w:val="20"/>
-              </w:rPr>
-              <w:t>), validación estática de tipos en Dart, funciones matemáticas puras para geolocalización libres de efectos secundarios (facilitando pruebas unitarias) y cumplimiento riguroso de privacidad (RNF-04) mediante eliminación de datos efímeros.</w:t>
+              <w:lastRenderedPageBreak/>
+              <w:t>4. Resguardo de la Calidad Disciplinar: Se aplicaron principios de diseño desacoplado (Single Responsibility Principle), validación estática de tipos en Dart, funciones matemáticas puras para geolocalización libres de efectos secundarios (facilitando pruebas unitarias) y cumplimiento riguroso de privacidad (RNF-04) mediante eliminación de datos efímeros.</w:t>
             </w:r>
           </w:p>
         </w:tc>
@@ -2181,25 +1435,7 @@
                 <w:sz w:val="18"/>
                 <w:szCs w:val="18"/>
               </w:rPr>
-              <w:t xml:space="preserve">Motor de </w:t>
-            </w:r>
-            <w:proofErr w:type="spellStart"/>
-            <w:r>
-              <w:rPr>
-                <w:rFonts w:ascii="Calibri" w:hAnsi="Calibri" w:cs="Arial"/>
-                <w:sz w:val="18"/>
-                <w:szCs w:val="18"/>
-              </w:rPr>
-              <w:t>geofencing</w:t>
-            </w:r>
-            <w:proofErr w:type="spellEnd"/>
-            <w:r>
-              <w:rPr>
-                <w:rFonts w:ascii="Calibri" w:hAnsi="Calibri" w:cs="Arial"/>
-                <w:sz w:val="18"/>
-                <w:szCs w:val="18"/>
-              </w:rPr>
-              <w:t xml:space="preserve"> predictivo con distancia geodésica</w:t>
+              <w:t>Motor de geofencing predictivo con distancia geodésica</w:t>
             </w:r>
           </w:p>
         </w:tc>
@@ -2211,70 +1447,14 @@
             <w:pPr>
               <w:spacing w:after="0"/>
             </w:pPr>
-            <w:proofErr w:type="spellStart"/>
-            <w:r>
-              <w:rPr>
-                <w:rFonts w:ascii="Calibri" w:hAnsi="Calibri" w:cs="Arial"/>
-                <w:sz w:val="18"/>
-                <w:szCs w:val="18"/>
-              </w:rPr>
-              <w:t>Flutter</w:t>
-            </w:r>
-            <w:proofErr w:type="spellEnd"/>
-            <w:r>
-              <w:rPr>
-                <w:rFonts w:ascii="Calibri" w:hAnsi="Calibri" w:cs="Arial"/>
-                <w:sz w:val="18"/>
-                <w:szCs w:val="18"/>
-              </w:rPr>
-              <w:t xml:space="preserve"> 3, Dart, </w:t>
-            </w:r>
-            <w:proofErr w:type="spellStart"/>
-            <w:r>
-              <w:rPr>
-                <w:rFonts w:ascii="Calibri" w:hAnsi="Calibri" w:cs="Arial"/>
-                <w:sz w:val="18"/>
-                <w:szCs w:val="18"/>
-              </w:rPr>
-              <w:t>Firebase</w:t>
-            </w:r>
-            <w:proofErr w:type="spellEnd"/>
-            <w:r>
-              <w:rPr>
-                <w:rFonts w:ascii="Calibri" w:hAnsi="Calibri" w:cs="Arial"/>
-                <w:sz w:val="18"/>
-                <w:szCs w:val="18"/>
-              </w:rPr>
-              <w:t xml:space="preserve"> </w:t>
-            </w:r>
-            <w:proofErr w:type="spellStart"/>
-            <w:r>
-              <w:rPr>
-                <w:rFonts w:ascii="Calibri" w:hAnsi="Calibri" w:cs="Arial"/>
-                <w:sz w:val="18"/>
-                <w:szCs w:val="18"/>
-              </w:rPr>
-              <w:t>Realtime</w:t>
-            </w:r>
-            <w:proofErr w:type="spellEnd"/>
-            <w:r>
-              <w:rPr>
-                <w:rFonts w:ascii="Calibri" w:hAnsi="Calibri" w:cs="Arial"/>
-                <w:sz w:val="18"/>
-                <w:szCs w:val="18"/>
-              </w:rPr>
-              <w:t xml:space="preserve"> </w:t>
-            </w:r>
-            <w:proofErr w:type="spellStart"/>
-            <w:r>
-              <w:rPr>
-                <w:rFonts w:ascii="Calibri" w:hAnsi="Calibri" w:cs="Arial"/>
-                <w:sz w:val="18"/>
-                <w:szCs w:val="18"/>
-              </w:rPr>
-              <w:t>Database</w:t>
-            </w:r>
-            <w:proofErr w:type="spellEnd"/>
+            <w:r>
+              <w:rPr>
+                <w:rFonts w:ascii="Calibri" w:hAnsi="Calibri" w:cs="Arial"/>
+                <w:sz w:val="18"/>
+                <w:szCs w:val="18"/>
+              </w:rPr>
+              <w:t>Flutter 3, Dart, Firebase Realtime Database</w:t>
+            </w:r>
           </w:p>
         </w:tc>
         <w:tc>
@@ -2365,61 +1545,7 @@
                 <w:sz w:val="18"/>
                 <w:szCs w:val="18"/>
               </w:rPr>
-              <w:t xml:space="preserve">Reemplazo de arquitectura MQTT/Redis por </w:t>
-            </w:r>
-            <w:proofErr w:type="spellStart"/>
-            <w:r>
-              <w:rPr>
-                <w:rFonts w:ascii="Calibri" w:hAnsi="Calibri" w:cs="Arial"/>
-                <w:sz w:val="18"/>
-                <w:szCs w:val="18"/>
-              </w:rPr>
-              <w:t>Firebase</w:t>
-            </w:r>
-            <w:proofErr w:type="spellEnd"/>
-            <w:r>
-              <w:rPr>
-                <w:rFonts w:ascii="Calibri" w:hAnsi="Calibri" w:cs="Arial"/>
-                <w:sz w:val="18"/>
-                <w:szCs w:val="18"/>
-              </w:rPr>
-              <w:t xml:space="preserve"> </w:t>
-            </w:r>
-            <w:proofErr w:type="spellStart"/>
-            <w:r>
-              <w:rPr>
-                <w:rFonts w:ascii="Calibri" w:hAnsi="Calibri" w:cs="Arial"/>
-                <w:sz w:val="18"/>
-                <w:szCs w:val="18"/>
-              </w:rPr>
-              <w:t>Realtime</w:t>
-            </w:r>
-            <w:proofErr w:type="spellEnd"/>
-            <w:r>
-              <w:rPr>
-                <w:rFonts w:ascii="Calibri" w:hAnsi="Calibri" w:cs="Arial"/>
-                <w:sz w:val="18"/>
-                <w:szCs w:val="18"/>
-              </w:rPr>
-              <w:t xml:space="preserve"> </w:t>
-            </w:r>
-            <w:proofErr w:type="spellStart"/>
-            <w:r>
-              <w:rPr>
-                <w:rFonts w:ascii="Calibri" w:hAnsi="Calibri" w:cs="Arial"/>
-                <w:sz w:val="18"/>
-                <w:szCs w:val="18"/>
-              </w:rPr>
-              <w:t>Database</w:t>
-            </w:r>
-            <w:proofErr w:type="spellEnd"/>
-            <w:r>
-              <w:rPr>
-                <w:rFonts w:ascii="Calibri" w:hAnsi="Calibri" w:cs="Arial"/>
-                <w:sz w:val="18"/>
-                <w:szCs w:val="18"/>
-              </w:rPr>
-              <w:t>.</w:t>
+              <w:t>Reemplazo de arquitectura MQTT/Redis por Firebase Realtime Database.</w:t>
             </w:r>
           </w:p>
         </w:tc>
@@ -2443,19 +1569,8 @@
                 <w:sz w:val="18"/>
                 <w:szCs w:val="18"/>
               </w:rPr>
-              <w:lastRenderedPageBreak/>
-              <w:t xml:space="preserve">Integración de servicios externos y </w:t>
-            </w:r>
-            <w:proofErr w:type="spellStart"/>
-            <w:r>
-              <w:rPr>
-                <w:rFonts w:ascii="Calibri" w:hAnsi="Calibri" w:cs="Arial"/>
-                <w:sz w:val="18"/>
-                <w:szCs w:val="18"/>
-              </w:rPr>
-              <w:t>APIs</w:t>
-            </w:r>
-            <w:proofErr w:type="spellEnd"/>
+              <w:t>Integración de servicios externos y APIs</w:t>
+            </w:r>
           </w:p>
         </w:tc>
         <w:tc>
@@ -2484,70 +1599,14 @@
             <w:pPr>
               <w:spacing w:after="0"/>
             </w:pPr>
-            <w:proofErr w:type="spellStart"/>
-            <w:r>
-              <w:rPr>
-                <w:rFonts w:ascii="Calibri" w:hAnsi="Calibri" w:cs="Arial"/>
-                <w:sz w:val="18"/>
-                <w:szCs w:val="18"/>
-              </w:rPr>
-              <w:t>Firebase</w:t>
-            </w:r>
-            <w:proofErr w:type="spellEnd"/>
-            <w:r>
-              <w:rPr>
-                <w:rFonts w:ascii="Calibri" w:hAnsi="Calibri" w:cs="Arial"/>
-                <w:sz w:val="18"/>
-                <w:szCs w:val="18"/>
-              </w:rPr>
-              <w:t xml:space="preserve"> Auth, </w:t>
-            </w:r>
-            <w:proofErr w:type="spellStart"/>
-            <w:r>
-              <w:rPr>
-                <w:rFonts w:ascii="Calibri" w:hAnsi="Calibri" w:cs="Arial"/>
-                <w:sz w:val="18"/>
-                <w:szCs w:val="18"/>
-              </w:rPr>
-              <w:t>Firestore</w:t>
-            </w:r>
-            <w:proofErr w:type="spellEnd"/>
-            <w:r>
-              <w:rPr>
-                <w:rFonts w:ascii="Calibri" w:hAnsi="Calibri" w:cs="Arial"/>
-                <w:sz w:val="18"/>
-                <w:szCs w:val="18"/>
-              </w:rPr>
-              <w:t xml:space="preserve">, REST API </w:t>
-            </w:r>
-            <w:proofErr w:type="spellStart"/>
-            <w:r>
-              <w:rPr>
-                <w:rFonts w:ascii="Calibri" w:hAnsi="Calibri" w:cs="Arial"/>
-                <w:sz w:val="18"/>
-                <w:szCs w:val="18"/>
-              </w:rPr>
-              <w:t>Identity</w:t>
-            </w:r>
-            <w:proofErr w:type="spellEnd"/>
-            <w:r>
-              <w:rPr>
-                <w:rFonts w:ascii="Calibri" w:hAnsi="Calibri" w:cs="Arial"/>
-                <w:sz w:val="18"/>
-                <w:szCs w:val="18"/>
-              </w:rPr>
-              <w:t xml:space="preserve"> </w:t>
-            </w:r>
-            <w:proofErr w:type="spellStart"/>
-            <w:r>
-              <w:rPr>
-                <w:rFonts w:ascii="Calibri" w:hAnsi="Calibri" w:cs="Arial"/>
-                <w:sz w:val="18"/>
-                <w:szCs w:val="18"/>
-              </w:rPr>
-              <w:t>Toolkit</w:t>
-            </w:r>
-            <w:proofErr w:type="spellEnd"/>
+            <w:r>
+              <w:rPr>
+                <w:rFonts w:ascii="Calibri" w:hAnsi="Calibri" w:cs="Arial"/>
+                <w:sz w:val="18"/>
+                <w:szCs w:val="18"/>
+              </w:rPr>
+              <w:t>Firebase Auth, Firestore, REST API Identity Toolkit</w:t>
+            </w:r>
           </w:p>
         </w:tc>
         <w:tc>
@@ -2600,61 +1659,7 @@
                 <w:sz w:val="18"/>
                 <w:szCs w:val="18"/>
               </w:rPr>
-              <w:t xml:space="preserve">Obstáculo resuelto: Desplazamiento de sesión </w:t>
-            </w:r>
-            <w:proofErr w:type="spellStart"/>
-            <w:r>
-              <w:rPr>
-                <w:rFonts w:ascii="Calibri" w:hAnsi="Calibri" w:cs="Arial"/>
-                <w:sz w:val="18"/>
-                <w:szCs w:val="18"/>
-              </w:rPr>
-              <w:t>admin</w:t>
-            </w:r>
-            <w:proofErr w:type="spellEnd"/>
-            <w:r>
-              <w:rPr>
-                <w:rFonts w:ascii="Calibri" w:hAnsi="Calibri" w:cs="Arial"/>
-                <w:sz w:val="18"/>
-                <w:szCs w:val="18"/>
-              </w:rPr>
-              <w:t xml:space="preserve"> solucionado invocando REST API de </w:t>
-            </w:r>
-            <w:proofErr w:type="spellStart"/>
-            <w:r>
-              <w:rPr>
-                <w:rFonts w:ascii="Calibri" w:hAnsi="Calibri" w:cs="Arial"/>
-                <w:sz w:val="18"/>
-                <w:szCs w:val="18"/>
-              </w:rPr>
-              <w:t>Identity</w:t>
-            </w:r>
-            <w:proofErr w:type="spellEnd"/>
-            <w:r>
-              <w:rPr>
-                <w:rFonts w:ascii="Calibri" w:hAnsi="Calibri" w:cs="Arial"/>
-                <w:sz w:val="18"/>
-                <w:szCs w:val="18"/>
-              </w:rPr>
-              <w:t xml:space="preserve"> </w:t>
-            </w:r>
-            <w:proofErr w:type="spellStart"/>
-            <w:r>
-              <w:rPr>
-                <w:rFonts w:ascii="Calibri" w:hAnsi="Calibri" w:cs="Arial"/>
-                <w:sz w:val="18"/>
-                <w:szCs w:val="18"/>
-              </w:rPr>
-              <w:t>Toolkit</w:t>
-            </w:r>
-            <w:proofErr w:type="spellEnd"/>
-            <w:r>
-              <w:rPr>
-                <w:rFonts w:ascii="Calibri" w:hAnsi="Calibri" w:cs="Arial"/>
-                <w:sz w:val="18"/>
-                <w:szCs w:val="18"/>
-              </w:rPr>
-              <w:t>.</w:t>
+              <w:t>Obstáculo resuelto: Desplazamiento de sesión admin solucionado invocando REST API de Identity Toolkit.</w:t>
             </w:r>
           </w:p>
         </w:tc>
@@ -2716,6 +1721,7 @@
                 <w:sz w:val="18"/>
                 <w:szCs w:val="18"/>
               </w:rPr>
+              <w:lastRenderedPageBreak/>
               <w:t>Desarrollo de aplicaciones multiplataforma</w:t>
             </w:r>
           </w:p>
@@ -2734,25 +1740,7 @@
                 <w:sz w:val="18"/>
                 <w:szCs w:val="18"/>
               </w:rPr>
-              <w:t xml:space="preserve">Módulo conductor particular: mapa, </w:t>
-            </w:r>
-            <w:proofErr w:type="spellStart"/>
-            <w:r>
-              <w:rPr>
-                <w:rFonts w:ascii="Calibri" w:hAnsi="Calibri" w:cs="Arial"/>
-                <w:sz w:val="18"/>
-                <w:szCs w:val="18"/>
-              </w:rPr>
-              <w:t>geofencing</w:t>
-            </w:r>
-            <w:proofErr w:type="spellEnd"/>
-            <w:r>
-              <w:rPr>
-                <w:rFonts w:ascii="Calibri" w:hAnsi="Calibri" w:cs="Arial"/>
-                <w:sz w:val="18"/>
-                <w:szCs w:val="18"/>
-              </w:rPr>
-              <w:t xml:space="preserve"> y alerta</w:t>
+              <w:t>Módulo conductor particular: mapa, geofencing y alerta</w:t>
             </w:r>
           </w:p>
         </w:tc>
@@ -2764,52 +1752,14 @@
             <w:pPr>
               <w:spacing w:after="0"/>
             </w:pPr>
-            <w:proofErr w:type="spellStart"/>
-            <w:r>
-              <w:rPr>
-                <w:rFonts w:ascii="Calibri" w:hAnsi="Calibri" w:cs="Arial"/>
-                <w:sz w:val="18"/>
-                <w:szCs w:val="18"/>
-              </w:rPr>
-              <w:t>Flutter</w:t>
-            </w:r>
-            <w:proofErr w:type="spellEnd"/>
-            <w:r>
-              <w:rPr>
-                <w:rFonts w:ascii="Calibri" w:hAnsi="Calibri" w:cs="Arial"/>
-                <w:sz w:val="18"/>
-                <w:szCs w:val="18"/>
-              </w:rPr>
-              <w:t xml:space="preserve">, Google </w:t>
-            </w:r>
-            <w:proofErr w:type="spellStart"/>
-            <w:r>
-              <w:rPr>
-                <w:rFonts w:ascii="Calibri" w:hAnsi="Calibri" w:cs="Arial"/>
-                <w:sz w:val="18"/>
-                <w:szCs w:val="18"/>
-              </w:rPr>
-              <w:t>Maps</w:t>
-            </w:r>
-            <w:proofErr w:type="spellEnd"/>
-            <w:r>
-              <w:rPr>
-                <w:rFonts w:ascii="Calibri" w:hAnsi="Calibri" w:cs="Arial"/>
-                <w:sz w:val="18"/>
-                <w:szCs w:val="18"/>
-              </w:rPr>
-              <w:t xml:space="preserve">, </w:t>
-            </w:r>
-            <w:proofErr w:type="spellStart"/>
-            <w:r>
-              <w:rPr>
-                <w:rFonts w:ascii="Calibri" w:hAnsi="Calibri" w:cs="Arial"/>
-                <w:sz w:val="18"/>
-                <w:szCs w:val="18"/>
-              </w:rPr>
-              <w:t>Geolocator</w:t>
-            </w:r>
-            <w:proofErr w:type="spellEnd"/>
+            <w:r>
+              <w:rPr>
+                <w:rFonts w:ascii="Calibri" w:hAnsi="Calibri" w:cs="Arial"/>
+                <w:sz w:val="18"/>
+                <w:szCs w:val="18"/>
+              </w:rPr>
+              <w:t>Flutter, Google Maps, Geolocator</w:t>
+            </w:r>
           </w:p>
         </w:tc>
         <w:tc>
@@ -2862,43 +1812,7 @@
                 <w:sz w:val="18"/>
                 <w:szCs w:val="18"/>
               </w:rPr>
-              <w:t xml:space="preserve">Facilitador: Componente </w:t>
-            </w:r>
-            <w:proofErr w:type="spellStart"/>
-            <w:r>
-              <w:rPr>
-                <w:rFonts w:ascii="Calibri" w:hAnsi="Calibri" w:cs="Arial"/>
-                <w:sz w:val="18"/>
-                <w:szCs w:val="18"/>
-              </w:rPr>
-              <w:t>overlay</w:t>
-            </w:r>
-            <w:proofErr w:type="spellEnd"/>
-            <w:r>
-              <w:rPr>
-                <w:rFonts w:ascii="Calibri" w:hAnsi="Calibri" w:cs="Arial"/>
-                <w:sz w:val="18"/>
-                <w:szCs w:val="18"/>
-              </w:rPr>
-              <w:t xml:space="preserve"> visual concluido. Obstáculo: Validación de </w:t>
-            </w:r>
-            <w:proofErr w:type="spellStart"/>
-            <w:r>
-              <w:rPr>
-                <w:rFonts w:ascii="Calibri" w:hAnsi="Calibri" w:cs="Arial"/>
-                <w:sz w:val="18"/>
-                <w:szCs w:val="18"/>
-              </w:rPr>
-              <w:t>background</w:t>
-            </w:r>
-            <w:proofErr w:type="spellEnd"/>
-            <w:r>
-              <w:rPr>
-                <w:rFonts w:ascii="Calibri" w:hAnsi="Calibri" w:cs="Arial"/>
-                <w:sz w:val="18"/>
-                <w:szCs w:val="18"/>
-              </w:rPr>
-              <w:t xml:space="preserve"> con velocidad &gt; 0 km/h en calle.</w:t>
+              <w:t>Facilitador: Componente overlay visual concluido. Obstáculo: Validación de background con velocidad &gt; 0 km/h en calle.</w:t>
             </w:r>
           </w:p>
         </w:tc>
@@ -2990,88 +1904,14 @@
             <w:pPr>
               <w:spacing w:after="0"/>
             </w:pPr>
-            <w:proofErr w:type="spellStart"/>
-            <w:r>
-              <w:rPr>
-                <w:rFonts w:ascii="Calibri" w:hAnsi="Calibri" w:cs="Arial"/>
-                <w:sz w:val="18"/>
-                <w:szCs w:val="18"/>
-              </w:rPr>
-              <w:t>Flutter</w:t>
-            </w:r>
-            <w:proofErr w:type="spellEnd"/>
-            <w:r>
-              <w:rPr>
-                <w:rFonts w:ascii="Calibri" w:hAnsi="Calibri" w:cs="Arial"/>
-                <w:sz w:val="18"/>
-                <w:szCs w:val="18"/>
-              </w:rPr>
-              <w:t xml:space="preserve">, </w:t>
-            </w:r>
-            <w:proofErr w:type="spellStart"/>
-            <w:r>
-              <w:rPr>
-                <w:rFonts w:ascii="Calibri" w:hAnsi="Calibri" w:cs="Arial"/>
-                <w:sz w:val="18"/>
-                <w:szCs w:val="18"/>
-              </w:rPr>
-              <w:t>Firebase</w:t>
-            </w:r>
-            <w:proofErr w:type="spellEnd"/>
-            <w:r>
-              <w:rPr>
-                <w:rFonts w:ascii="Calibri" w:hAnsi="Calibri" w:cs="Arial"/>
-                <w:sz w:val="18"/>
-                <w:szCs w:val="18"/>
-              </w:rPr>
-              <w:t xml:space="preserve"> </w:t>
-            </w:r>
-            <w:proofErr w:type="spellStart"/>
-            <w:r>
-              <w:rPr>
-                <w:rFonts w:ascii="Calibri" w:hAnsi="Calibri" w:cs="Arial"/>
-                <w:sz w:val="18"/>
-                <w:szCs w:val="18"/>
-              </w:rPr>
-              <w:t>Realtime</w:t>
-            </w:r>
-            <w:proofErr w:type="spellEnd"/>
-            <w:r>
-              <w:rPr>
-                <w:rFonts w:ascii="Calibri" w:hAnsi="Calibri" w:cs="Arial"/>
-                <w:sz w:val="18"/>
-                <w:szCs w:val="18"/>
-              </w:rPr>
-              <w:t xml:space="preserve"> </w:t>
-            </w:r>
-            <w:proofErr w:type="spellStart"/>
-            <w:r>
-              <w:rPr>
-                <w:rFonts w:ascii="Calibri" w:hAnsi="Calibri" w:cs="Arial"/>
-                <w:sz w:val="18"/>
-                <w:szCs w:val="18"/>
-              </w:rPr>
-              <w:t>Database</w:t>
-            </w:r>
-            <w:proofErr w:type="spellEnd"/>
-            <w:r>
-              <w:rPr>
-                <w:rFonts w:ascii="Calibri" w:hAnsi="Calibri" w:cs="Arial"/>
-                <w:sz w:val="18"/>
-                <w:szCs w:val="18"/>
-              </w:rPr>
-              <w:t xml:space="preserve">, </w:t>
-            </w:r>
-            <w:proofErr w:type="spellStart"/>
-            <w:r>
-              <w:rPr>
-                <w:rFonts w:ascii="Calibri" w:hAnsi="Calibri" w:cs="Arial"/>
-                <w:sz w:val="18"/>
-                <w:szCs w:val="18"/>
-              </w:rPr>
-              <w:t>Geolocator</w:t>
-            </w:r>
-            <w:proofErr w:type="spellEnd"/>
+            <w:r>
+              <w:rPr>
+                <w:rFonts w:ascii="Calibri" w:hAnsi="Calibri" w:cs="Arial"/>
+                <w:sz w:val="18"/>
+                <w:szCs w:val="18"/>
+              </w:rPr>
+              <w:t>Flutter, Firebase Realtime Database, Geolocator</w:t>
+            </w:r>
           </w:p>
         </w:tc>
         <w:tc>
@@ -3216,52 +2056,14 @@
             <w:pPr>
               <w:spacing w:after="0"/>
             </w:pPr>
-            <w:proofErr w:type="spellStart"/>
-            <w:r>
-              <w:rPr>
-                <w:rFonts w:ascii="Calibri" w:hAnsi="Calibri" w:cs="Arial"/>
-                <w:sz w:val="18"/>
-                <w:szCs w:val="18"/>
-              </w:rPr>
-              <w:t>Flutter</w:t>
-            </w:r>
-            <w:proofErr w:type="spellEnd"/>
-            <w:r>
-              <w:rPr>
-                <w:rFonts w:ascii="Calibri" w:hAnsi="Calibri" w:cs="Arial"/>
-                <w:sz w:val="18"/>
-                <w:szCs w:val="18"/>
-              </w:rPr>
-              <w:t xml:space="preserve"> Web, Cloud </w:t>
-            </w:r>
-            <w:proofErr w:type="spellStart"/>
-            <w:r>
-              <w:rPr>
-                <w:rFonts w:ascii="Calibri" w:hAnsi="Calibri" w:cs="Arial"/>
-                <w:sz w:val="18"/>
-                <w:szCs w:val="18"/>
-              </w:rPr>
-              <w:t>Firestore</w:t>
-            </w:r>
-            <w:proofErr w:type="spellEnd"/>
-            <w:r>
-              <w:rPr>
-                <w:rFonts w:ascii="Calibri" w:hAnsi="Calibri" w:cs="Arial"/>
-                <w:sz w:val="18"/>
-                <w:szCs w:val="18"/>
-              </w:rPr>
-              <w:t xml:space="preserve">, </w:t>
-            </w:r>
-            <w:proofErr w:type="spellStart"/>
-            <w:r>
-              <w:rPr>
-                <w:rFonts w:ascii="Calibri" w:hAnsi="Calibri" w:cs="Arial"/>
-                <w:sz w:val="18"/>
-                <w:szCs w:val="18"/>
-              </w:rPr>
-              <w:t>GoRouter</w:t>
-            </w:r>
-            <w:proofErr w:type="spellEnd"/>
+            <w:r>
+              <w:rPr>
+                <w:rFonts w:ascii="Calibri" w:hAnsi="Calibri" w:cs="Arial"/>
+                <w:sz w:val="18"/>
+                <w:szCs w:val="18"/>
+              </w:rPr>
+              <w:t>Flutter Web, Cloud Firestore, GoRouter</w:t>
+            </w:r>
           </w:p>
         </w:tc>
         <w:tc>
@@ -3314,25 +2116,7 @@
                 <w:sz w:val="18"/>
                 <w:szCs w:val="18"/>
               </w:rPr>
-              <w:t xml:space="preserve">Facilitador: Formularios CRUD reactivos en </w:t>
-            </w:r>
-            <w:proofErr w:type="spellStart"/>
-            <w:r>
-              <w:rPr>
-                <w:rFonts w:ascii="Calibri" w:hAnsi="Calibri" w:cs="Arial"/>
-                <w:sz w:val="18"/>
-                <w:szCs w:val="18"/>
-              </w:rPr>
-              <w:t>Firestore</w:t>
-            </w:r>
-            <w:proofErr w:type="spellEnd"/>
-            <w:r>
-              <w:rPr>
-                <w:rFonts w:ascii="Calibri" w:hAnsi="Calibri" w:cs="Arial"/>
-                <w:sz w:val="18"/>
-                <w:szCs w:val="18"/>
-              </w:rPr>
-              <w:t xml:space="preserve"> y selectores de vinculación vehículo-conductor operativos.</w:t>
+              <w:t>Facilitador: Formularios CRUD reactivos en Firestore y selectores de vinculación vehículo-conductor operativos.</w:t>
             </w:r>
           </w:p>
         </w:tc>
@@ -3394,18 +2178,8 @@
                 <w:sz w:val="18"/>
                 <w:szCs w:val="18"/>
               </w:rPr>
-              <w:t xml:space="preserve">Gestión de notificaciones y mensajería </w:t>
-            </w:r>
-            <w:proofErr w:type="spellStart"/>
-            <w:r>
-              <w:rPr>
-                <w:rFonts w:ascii="Calibri" w:hAnsi="Calibri" w:cs="Arial"/>
-                <w:sz w:val="18"/>
-                <w:szCs w:val="18"/>
-              </w:rPr>
-              <w:t>push</w:t>
-            </w:r>
-            <w:proofErr w:type="spellEnd"/>
+              <w:t>Gestión de notificaciones y mensajería push</w:t>
+            </w:r>
           </w:p>
         </w:tc>
         <w:tc>
@@ -3422,25 +2196,7 @@
                 <w:sz w:val="18"/>
                 <w:szCs w:val="18"/>
               </w:rPr>
-              <w:t xml:space="preserve">Notificaciones locales y </w:t>
-            </w:r>
-            <w:proofErr w:type="spellStart"/>
-            <w:r>
-              <w:rPr>
-                <w:rFonts w:ascii="Calibri" w:hAnsi="Calibri" w:cs="Arial"/>
-                <w:sz w:val="18"/>
-                <w:szCs w:val="18"/>
-              </w:rPr>
-              <w:t>push</w:t>
-            </w:r>
-            <w:proofErr w:type="spellEnd"/>
-            <w:r>
-              <w:rPr>
-                <w:rFonts w:ascii="Calibri" w:hAnsi="Calibri" w:cs="Arial"/>
-                <w:sz w:val="18"/>
-                <w:szCs w:val="18"/>
-              </w:rPr>
-              <w:t xml:space="preserve"> de alta prioridad</w:t>
+              <w:t>Notificaciones locales y push de alta prioridad</w:t>
             </w:r>
           </w:p>
         </w:tc>
@@ -3458,18 +2214,8 @@
                 <w:sz w:val="18"/>
                 <w:szCs w:val="18"/>
               </w:rPr>
-              <w:t xml:space="preserve">FCM, </w:t>
-            </w:r>
-            <w:proofErr w:type="spellStart"/>
-            <w:r>
-              <w:rPr>
-                <w:rFonts w:ascii="Calibri" w:hAnsi="Calibri" w:cs="Arial"/>
-                <w:sz w:val="18"/>
-                <w:szCs w:val="18"/>
-              </w:rPr>
-              <w:t>flutter_local_notifications</w:t>
-            </w:r>
-            <w:proofErr w:type="spellEnd"/>
+              <w:t>FCM, flutter_local_notifications</w:t>
+            </w:r>
           </w:p>
         </w:tc>
         <w:tc>
@@ -3554,23 +2300,13 @@
             <w:pPr>
               <w:spacing w:after="0"/>
             </w:pPr>
-            <w:proofErr w:type="spellStart"/>
-            <w:r>
-              <w:rPr>
-                <w:rFonts w:ascii="Calibri" w:hAnsi="Calibri" w:cs="Arial"/>
-                <w:sz w:val="18"/>
-                <w:szCs w:val="18"/>
-              </w:rPr>
-              <w:t>Overlay</w:t>
-            </w:r>
-            <w:proofErr w:type="spellEnd"/>
-            <w:r>
-              <w:rPr>
-                <w:rFonts w:ascii="Calibri" w:hAnsi="Calibri" w:cs="Arial"/>
-                <w:sz w:val="18"/>
-                <w:szCs w:val="18"/>
-              </w:rPr>
-              <w:t xml:space="preserve"> visual actúa como respaldo de alerta en entorno web.</w:t>
+            <w:r>
+              <w:rPr>
+                <w:rFonts w:ascii="Calibri" w:hAnsi="Calibri" w:cs="Arial"/>
+                <w:sz w:val="18"/>
+                <w:szCs w:val="18"/>
+              </w:rPr>
+              <w:t>Overlay visual actúa como respaldo de alerta en entorno web.</w:t>
             </w:r>
           </w:p>
         </w:tc>
@@ -3594,7 +2330,6 @@
                 <w:sz w:val="18"/>
                 <w:szCs w:val="18"/>
               </w:rPr>
-              <w:lastRenderedPageBreak/>
               <w:t>Validación y pruebas del sistema</w:t>
             </w:r>
           </w:p>
@@ -3747,6 +2482,7 @@
                 <w:sz w:val="18"/>
                 <w:szCs w:val="18"/>
               </w:rPr>
+              <w:lastRenderedPageBreak/>
               <w:t>Validación y pruebas del sistema</w:t>
             </w:r>
           </w:p>
@@ -3777,23 +2513,13 @@
             <w:pPr>
               <w:spacing w:after="0"/>
             </w:pPr>
-            <w:proofErr w:type="spellStart"/>
-            <w:r>
-              <w:rPr>
-                <w:rFonts w:ascii="Calibri" w:hAnsi="Calibri" w:cs="Arial"/>
-                <w:sz w:val="18"/>
-                <w:szCs w:val="18"/>
-              </w:rPr>
-              <w:t>Firebase</w:t>
-            </w:r>
-            <w:proofErr w:type="spellEnd"/>
-            <w:r>
-              <w:rPr>
-                <w:rFonts w:ascii="Calibri" w:hAnsi="Calibri" w:cs="Arial"/>
-                <w:sz w:val="18"/>
-                <w:szCs w:val="18"/>
-              </w:rPr>
-              <w:t>, scripts de prueba en terminal</w:t>
+            <w:r>
+              <w:rPr>
+                <w:rFonts w:ascii="Calibri" w:hAnsi="Calibri" w:cs="Arial"/>
+                <w:sz w:val="18"/>
+                <w:szCs w:val="18"/>
+              </w:rPr>
+              <w:t>Firebase, scripts de prueba en terminal</w:t>
             </w:r>
           </w:p>
         </w:tc>
@@ -3885,25 +2611,7 @@
                 <w:sz w:val="18"/>
                 <w:szCs w:val="18"/>
               </w:rPr>
-              <w:t xml:space="preserve">Soporte </w:t>
-            </w:r>
-            <w:proofErr w:type="spellStart"/>
-            <w:r>
-              <w:rPr>
-                <w:rFonts w:ascii="Calibri" w:hAnsi="Calibri" w:cs="Arial"/>
-                <w:sz w:val="18"/>
-                <w:szCs w:val="18"/>
-              </w:rPr>
-              <w:t>multicoche</w:t>
-            </w:r>
-            <w:proofErr w:type="spellEnd"/>
-            <w:r>
-              <w:rPr>
-                <w:rFonts w:ascii="Calibri" w:hAnsi="Calibri" w:cs="Arial"/>
-                <w:sz w:val="18"/>
-                <w:szCs w:val="18"/>
-              </w:rPr>
-              <w:t xml:space="preserve"> registrado como mejora incremental para Fase 3.</w:t>
+              <w:t>Soporte multicoche registrado como mejora incremental para Fase 3.</w:t>
             </w:r>
           </w:p>
         </w:tc>
@@ -4187,43 +2895,7 @@
                 <w:sz w:val="18"/>
                 <w:szCs w:val="18"/>
               </w:rPr>
-              <w:t xml:space="preserve">1. La arquitectura basada en flujos reactivos de </w:t>
-            </w:r>
-            <w:proofErr w:type="spellStart"/>
-            <w:r>
-              <w:rPr>
-                <w:rFonts w:ascii="Calibri" w:hAnsi="Calibri" w:cs="Arial"/>
-                <w:sz w:val="18"/>
-                <w:szCs w:val="18"/>
-              </w:rPr>
-              <w:t>Firebase</w:t>
-            </w:r>
-            <w:proofErr w:type="spellEnd"/>
-            <w:r>
-              <w:rPr>
-                <w:rFonts w:ascii="Calibri" w:hAnsi="Calibri" w:cs="Arial"/>
-                <w:sz w:val="18"/>
-                <w:szCs w:val="18"/>
-              </w:rPr>
-              <w:t xml:space="preserve"> (Streams en </w:t>
-            </w:r>
-            <w:proofErr w:type="spellStart"/>
-            <w:r>
-              <w:rPr>
-                <w:rFonts w:ascii="Calibri" w:hAnsi="Calibri" w:cs="Arial"/>
-                <w:sz w:val="18"/>
-                <w:szCs w:val="18"/>
-              </w:rPr>
-              <w:t>Flutter</w:t>
-            </w:r>
-            <w:proofErr w:type="spellEnd"/>
-            <w:r>
-              <w:rPr>
-                <w:rFonts w:ascii="Calibri" w:hAnsi="Calibri" w:cs="Arial"/>
-                <w:sz w:val="18"/>
-                <w:szCs w:val="18"/>
-              </w:rPr>
-              <w:t>) simplificó la sincronización de estado en tiempo real sin requerir la implementación de sockets manuales.</w:t>
+              <w:t>1. La arquitectura basada en flujos reactivos de Firebase (Streams en Flutter) simplificó la sincronización de estado en tiempo real sin requerir la implementación de sockets manuales.</w:t>
             </w:r>
           </w:p>
           <w:p>
@@ -4237,25 +2909,7 @@
                 <w:sz w:val="18"/>
                 <w:szCs w:val="18"/>
               </w:rPr>
-              <w:t xml:space="preserve">2. La </w:t>
-            </w:r>
-            <w:proofErr w:type="spellStart"/>
-            <w:r>
-              <w:rPr>
-                <w:rFonts w:ascii="Calibri" w:hAnsi="Calibri" w:cs="Arial"/>
-                <w:sz w:val="18"/>
-                <w:szCs w:val="18"/>
-              </w:rPr>
-              <w:t>modularización</w:t>
-            </w:r>
-            <w:proofErr w:type="spellEnd"/>
-            <w:r>
-              <w:rPr>
-                <w:rFonts w:ascii="Calibri" w:hAnsi="Calibri" w:cs="Arial"/>
-                <w:sz w:val="18"/>
-                <w:szCs w:val="18"/>
-              </w:rPr>
-              <w:t xml:space="preserve"> del código por capas limpias (Modelos, Servicios, Vistas y Componentes) permitió distribuir las tareas entre los integrantes sin provocar colisiones en el control de versiones.</w:t>
+              <w:t>2. La modularización del código por capas limpias (Modelos, Servicios, Vistas y Componentes) permitió distribuir las tareas entre los integrantes sin provocar colisiones en el control de versiones.</w:t>
             </w:r>
           </w:p>
           <w:p>
@@ -4303,97 +2957,7 @@
                 <w:sz w:val="18"/>
                 <w:szCs w:val="18"/>
               </w:rPr>
-              <w:t xml:space="preserve">1. Desconexión de sesión en panel administrativo: Al dar de alta un conductor de rescate con el SDK cliente de </w:t>
-            </w:r>
-            <w:proofErr w:type="spellStart"/>
-            <w:r>
-              <w:rPr>
-                <w:rFonts w:ascii="Calibri" w:hAnsi="Calibri" w:cs="Arial"/>
-                <w:sz w:val="18"/>
-                <w:szCs w:val="18"/>
-              </w:rPr>
-              <w:t>Firebase</w:t>
-            </w:r>
-            <w:proofErr w:type="spellEnd"/>
-            <w:r>
-              <w:rPr>
-                <w:rFonts w:ascii="Calibri" w:hAnsi="Calibri" w:cs="Arial"/>
-                <w:sz w:val="18"/>
-                <w:szCs w:val="18"/>
-              </w:rPr>
-              <w:t xml:space="preserve">, el administrador era </w:t>
-            </w:r>
-            <w:proofErr w:type="spellStart"/>
-            <w:r>
-              <w:rPr>
-                <w:rFonts w:ascii="Calibri" w:hAnsi="Calibri" w:cs="Arial"/>
-                <w:sz w:val="18"/>
-                <w:szCs w:val="18"/>
-              </w:rPr>
-              <w:t>deslogueado</w:t>
-            </w:r>
-            <w:proofErr w:type="spellEnd"/>
-            <w:r>
-              <w:rPr>
-                <w:rFonts w:ascii="Calibri" w:hAnsi="Calibri" w:cs="Arial"/>
-                <w:sz w:val="18"/>
-                <w:szCs w:val="18"/>
-              </w:rPr>
-              <w:t xml:space="preserve">. Se subsanó consumiendo directamente la REST API pública de </w:t>
-            </w:r>
-            <w:proofErr w:type="spellStart"/>
-            <w:r>
-              <w:rPr>
-                <w:rFonts w:ascii="Calibri" w:hAnsi="Calibri" w:cs="Arial"/>
-                <w:sz w:val="18"/>
-                <w:szCs w:val="18"/>
-              </w:rPr>
-              <w:t>Firebase</w:t>
-            </w:r>
-            <w:proofErr w:type="spellEnd"/>
-            <w:r>
-              <w:rPr>
-                <w:rFonts w:ascii="Calibri" w:hAnsi="Calibri" w:cs="Arial"/>
-                <w:sz w:val="18"/>
-                <w:szCs w:val="18"/>
-              </w:rPr>
-              <w:t xml:space="preserve"> </w:t>
-            </w:r>
-            <w:proofErr w:type="spellStart"/>
-            <w:r>
-              <w:rPr>
-                <w:rFonts w:ascii="Calibri" w:hAnsi="Calibri" w:cs="Arial"/>
-                <w:sz w:val="18"/>
-                <w:szCs w:val="18"/>
-              </w:rPr>
-              <w:t>Identity</w:t>
-            </w:r>
-            <w:proofErr w:type="spellEnd"/>
-            <w:r>
-              <w:rPr>
-                <w:rFonts w:ascii="Calibri" w:hAnsi="Calibri" w:cs="Arial"/>
-                <w:sz w:val="18"/>
-                <w:szCs w:val="18"/>
-              </w:rPr>
-              <w:t xml:space="preserve"> </w:t>
-            </w:r>
-            <w:proofErr w:type="spellStart"/>
-            <w:r>
-              <w:rPr>
-                <w:rFonts w:ascii="Calibri" w:hAnsi="Calibri" w:cs="Arial"/>
-                <w:sz w:val="18"/>
-                <w:szCs w:val="18"/>
-              </w:rPr>
-              <w:t>Toolkit</w:t>
-            </w:r>
-            <w:proofErr w:type="spellEnd"/>
-            <w:r>
-              <w:rPr>
-                <w:rFonts w:ascii="Calibri" w:hAnsi="Calibri" w:cs="Arial"/>
-                <w:sz w:val="18"/>
-                <w:szCs w:val="18"/>
-              </w:rPr>
-              <w:t xml:space="preserve"> con cabeceras de autorización separadas.</w:t>
+              <w:t>1. Desconexión de sesión en panel administrativo: Al dar de alta un conductor de rescate con el SDK cliente de Firebase, el administrador era deslogueado. Se subsanó consumiendo directamente la REST API pública de Firebase Identity Toolkit con cabeceras de autorización separadas.</w:t>
             </w:r>
           </w:p>
         </w:tc>
@@ -4468,25 +3032,7 @@
                 <w:sz w:val="18"/>
                 <w:szCs w:val="18"/>
               </w:rPr>
-              <w:t>• Ajuste de la Arquitectura de Transporte (</w:t>
-            </w:r>
-            <w:proofErr w:type="spellStart"/>
-            <w:r>
-              <w:rPr>
-                <w:rFonts w:ascii="Calibri" w:hAnsi="Calibri" w:cs="Arial"/>
-                <w:sz w:val="18"/>
-                <w:szCs w:val="18"/>
-              </w:rPr>
-              <w:t>Backend</w:t>
-            </w:r>
-            <w:proofErr w:type="spellEnd"/>
-            <w:r>
-              <w:rPr>
-                <w:rFonts w:ascii="Calibri" w:hAnsi="Calibri" w:cs="Arial"/>
-                <w:sz w:val="18"/>
-                <w:szCs w:val="18"/>
-              </w:rPr>
-              <w:t>/Ingesta):</w:t>
+              <w:t>• Ajuste de la Arquitectura de Transporte (Backend/Ingesta):</w:t>
             </w:r>
           </w:p>
           <w:p>
@@ -4500,79 +3046,7 @@
                 <w:sz w:val="18"/>
                 <w:szCs w:val="18"/>
               </w:rPr>
-              <w:t xml:space="preserve">Se ajustó el enfoque original (servidor dedicado Node.js/Python con </w:t>
-            </w:r>
-            <w:proofErr w:type="spellStart"/>
-            <w:r>
-              <w:rPr>
-                <w:rFonts w:ascii="Calibri" w:hAnsi="Calibri" w:cs="Arial"/>
-                <w:sz w:val="18"/>
-                <w:szCs w:val="18"/>
-              </w:rPr>
-              <w:t>broker</w:t>
-            </w:r>
-            <w:proofErr w:type="spellEnd"/>
-            <w:r>
-              <w:rPr>
-                <w:rFonts w:ascii="Calibri" w:hAnsi="Calibri" w:cs="Arial"/>
-                <w:sz w:val="18"/>
-                <w:szCs w:val="18"/>
-              </w:rPr>
-              <w:t xml:space="preserve"> MQTT y Redis) en favor de </w:t>
-            </w:r>
-            <w:proofErr w:type="spellStart"/>
-            <w:r>
-              <w:rPr>
-                <w:rFonts w:ascii="Calibri" w:hAnsi="Calibri" w:cs="Arial"/>
-                <w:sz w:val="18"/>
-                <w:szCs w:val="18"/>
-              </w:rPr>
-              <w:t>Firebase</w:t>
-            </w:r>
-            <w:proofErr w:type="spellEnd"/>
-            <w:r>
-              <w:rPr>
-                <w:rFonts w:ascii="Calibri" w:hAnsi="Calibri" w:cs="Arial"/>
-                <w:sz w:val="18"/>
-                <w:szCs w:val="18"/>
-              </w:rPr>
-              <w:t xml:space="preserve"> </w:t>
-            </w:r>
-            <w:proofErr w:type="spellStart"/>
-            <w:r>
-              <w:rPr>
-                <w:rFonts w:ascii="Calibri" w:hAnsi="Calibri" w:cs="Arial"/>
-                <w:sz w:val="18"/>
-                <w:szCs w:val="18"/>
-              </w:rPr>
-              <w:t>Realtime</w:t>
-            </w:r>
-            <w:proofErr w:type="spellEnd"/>
-            <w:r>
-              <w:rPr>
-                <w:rFonts w:ascii="Calibri" w:hAnsi="Calibri" w:cs="Arial"/>
-                <w:sz w:val="18"/>
-                <w:szCs w:val="18"/>
-              </w:rPr>
-              <w:t xml:space="preserve"> </w:t>
-            </w:r>
-            <w:proofErr w:type="spellStart"/>
-            <w:r>
-              <w:rPr>
-                <w:rFonts w:ascii="Calibri" w:hAnsi="Calibri" w:cs="Arial"/>
-                <w:sz w:val="18"/>
-                <w:szCs w:val="18"/>
-              </w:rPr>
-              <w:t>Database</w:t>
-            </w:r>
-            <w:proofErr w:type="spellEnd"/>
-            <w:r>
-              <w:rPr>
-                <w:rFonts w:ascii="Calibri" w:hAnsi="Calibri" w:cs="Arial"/>
-                <w:sz w:val="18"/>
-                <w:szCs w:val="18"/>
-              </w:rPr>
-              <w:t>. Este cambio se justificó por la necesidad de asegurar la factibilidad técnica y operativa del MVP dentro del semestre, eliminando costos y complejidad de despliegue sin comprometer la latencia requerida (&lt; 2 s).</w:t>
+              <w:t>Se ajustó el enfoque original (servidor dedicado Node.js/Python con broker MQTT y Redis) en favor de Firebase Realtime Database. Este cambio se justificó por la necesidad de asegurar la factibilidad técnica y operativa del MVP dentro del semestre, eliminando costos y complejidad de despliegue sin comprometer la latencia requerida (&lt; 2 s).</w:t>
             </w:r>
           </w:p>
           <w:p>
@@ -4606,7 +3080,6 @@
                 <w:sz w:val="18"/>
                 <w:szCs w:val="18"/>
               </w:rPr>
-              <w:lastRenderedPageBreak/>
               <w:t>Se pospuso la pantalla de configuración manual de umbrales para dar prioridad a la estabilidad del motor predictivo y la visualización de la alerta. Los parámetros se parametrizaron como constantes operativas del sistema (30 segundos de anticipación).</w:t>
             </w:r>
           </w:p>
@@ -4685,6 +3158,7 @@
                 <w:rFonts w:ascii="Calibri" w:hAnsi="Calibri"/>
                 <w:color w:val="1F3864" w:themeColor="accent1" w:themeShade="80"/>
               </w:rPr>
+              <w:lastRenderedPageBreak/>
               <w:t>Actividades que no has iniciado o están retrasadas:</w:t>
             </w:r>
           </w:p>
@@ -6262,6 +4736,12 @@
 </file>
 
 <file path=customXml/item2.xml><?xml version="1.0" encoding="utf-8"?>
+<p:properties xmlns:p="http://schemas.microsoft.com/office/2006/metadata/properties" xmlns:xsi="http://www.w3.org/2001/XMLSchema-instance" xmlns:pc="http://schemas.microsoft.com/office/infopath/2007/PartnerControls">
+  <documentManagement/>
+</p:properties>
+</file>
+
+<file path=customXml/item3.xml><?xml version="1.0" encoding="utf-8"?>
 <ct:contentTypeSchema xmlns:ct="http://schemas.microsoft.com/office/2006/metadata/contentType" xmlns:ma="http://schemas.microsoft.com/office/2006/metadata/properties/metaAttributes" ct:_="" ma:_="" ma:contentTypeName="Documento" ma:contentTypeID="0x010100E96778489EE7714D8BD12CC105EB918B" ma:contentTypeVersion="2" ma:contentTypeDescription="Crear nuevo documento." ma:contentTypeScope="" ma:versionID="416c5c7ae9b5d54d83875cd3c65194e3">
   <xsd:schema xmlns:xsd="http://www.w3.org/2001/XMLSchema" xmlns:xs="http://www.w3.org/2001/XMLSchema" xmlns:p="http://schemas.microsoft.com/office/2006/metadata/properties" xmlns:ns2="126e8a1c-9ea9-435a-ac89-d06c80d62e30" targetNamespace="http://schemas.microsoft.com/office/2006/metadata/properties" ma:root="true" ma:fieldsID="70a237c842677bd850644f8595079f5e" ns2:_="">
     <xsd:import namespace="126e8a1c-9ea9-435a-ac89-d06c80d62e30"/>
@@ -6393,12 +4873,6 @@
 </ct:contentTypeSchema>
 </file>
 
-<file path=customXml/item3.xml><?xml version="1.0" encoding="utf-8"?>
-<p:properties xmlns:p="http://schemas.microsoft.com/office/2006/metadata/properties" xmlns:xsi="http://www.w3.org/2001/XMLSchema-instance" xmlns:pc="http://schemas.microsoft.com/office/infopath/2007/PartnerControls">
-  <documentManagement/>
-</p:properties>
-</file>
-
 <file path=customXml/itemProps1.xml><?xml version="1.0" encoding="utf-8"?>
 <ds:datastoreItem xmlns:ds="http://schemas.openxmlformats.org/officeDocument/2006/customXml" ds:itemID="{D51C61E4-DB75-4684-AD25-71F546404E96}">
   <ds:schemaRefs>
@@ -6408,6 +4882,15 @@
 </file>
 
 <file path=customXml/itemProps2.xml><?xml version="1.0" encoding="utf-8"?>
+<ds:datastoreItem xmlns:ds="http://schemas.openxmlformats.org/officeDocument/2006/customXml" ds:itemID="{46CA5683-AF87-4E40-B841-2E23A3B52406}">
+  <ds:schemaRefs>
+    <ds:schemaRef ds:uri="http://schemas.microsoft.com/office/2006/metadata/properties"/>
+    <ds:schemaRef ds:uri="http://schemas.microsoft.com/office/infopath/2007/PartnerControls"/>
+  </ds:schemaRefs>
+</ds:datastoreItem>
+</file>
+
+<file path=customXml/itemProps3.xml><?xml version="1.0" encoding="utf-8"?>
 <ds:datastoreItem xmlns:ds="http://schemas.openxmlformats.org/officeDocument/2006/customXml" ds:itemID="{6F3661B0-5934-4FAB-ADC6-33A19B814E8D}">
   <ds:schemaRefs>
     <ds:schemaRef ds:uri="http://schemas.microsoft.com/office/2006/metadata/contentType"/>
@@ -6423,13 +4906,4 @@
     <ds:schemaRef ds:uri="http://schemas.microsoft.com/internal/obd"/>
   </ds:schemaRefs>
 </ds:datastoreItem>
-</file>
-
-<file path=customXml/itemProps3.xml><?xml version="1.0" encoding="utf-8"?>
-<ds:datastoreItem xmlns:ds="http://schemas.openxmlformats.org/officeDocument/2006/customXml" ds:itemID="{46CA5683-AF87-4E40-B841-2E23A3B52406}">
-  <ds:schemaRefs>
-    <ds:schemaRef ds:uri="http://schemas.microsoft.com/office/2006/metadata/properties"/>
-    <ds:schemaRef ds:uri="http://schemas.microsoft.com/office/infopath/2007/PartnerControls"/>
-  </ds:schemaRefs>
-</ds:datastoreItem>
 </file>
</xml_diff>